<commit_message>
Review actual v1 retest and finalize honest English submission documents
</commit_message>
<xml_diff>
--- a/MASY1800_ET_Agent_Scaffold_v1_0/agents/disruption_agent/deliverables/00_Submission_Checklist.docx
+++ b/MASY1800_ET_Agent_Scaffold_v1_0/agents/disruption_agent/deliverables/00_Submission_Checklist.docx
@@ -7,12 +7,12 @@
         <w:pStyle w:val="Heading1"/>
       </w:pPr>
       <w:r>
-        <w:t>Submission checklist and package status</w:t>
+        <w:t>Brightspace submission checklist and package map</w:t>
       </w:r>
     </w:p>
     <w:p>
       <w:r>
-        <w:t>REVIEW DRAFT — DO NOT SUBMIT AS COMPLETE. A genuine revised-agent ChatGPT retest and student personal review remain outstanding.</w:t>
+        <w:t>The package contains the required English work products and actual test/revision evidence. This is a bounded tested candidate with retained weaknesses, not a claim that every analytical acceptance criterion passed. Personal drafts require student review; exact due date, accepted formats and upload arrangement must be checked in the actual course item.</w:t>
       </w:r>
     </w:p>
     <w:tbl>
@@ -48,7 +48,7 @@
               <w:rPr>
                 <w:b/>
               </w:rPr>
-              <w:t>Current evidence/status</w:t>
+              <w:t>Evidence / disposition</w:t>
             </w:r>
           </w:p>
         </w:tc>
@@ -60,7 +60,7 @@
           </w:tcPr>
           <w:p>
             <w:r>
-              <w:t>Instructor scaffold/template preserved</w:t>
+              <w:t>Instructor scaffold/common contracts/tools</w:t>
             </w:r>
           </w:p>
         </w:tc>
@@ -70,7 +70,7 @@
           </w:tcPr>
           <w:p>
             <w:r>
-              <w:t>All original package/frozen hashes checked; no common/tool edits</w:t>
+              <w:t>Original package and frozen hashes verified; no core/tool changes</w:t>
             </w:r>
           </w:p>
         </w:tc>
@@ -82,7 +82,7 @@
           </w:tcPr>
           <w:p>
             <w:r>
-              <w:t>Reusable specialist and common contract</w:t>
+              <w:t>Specialist package</w:t>
             </w:r>
           </w:p>
         </w:tc>
@@ -92,7 +92,7 @@
           </w:tcPr>
           <w:p>
             <w:r>
-              <w:t>Implemented; revision 0.4-reviewed</w:t>
+              <w:t>Template-derived 0.4-reviewed instructions, metadata, three cases, original/revised packets, source register and limitations</w:t>
             </w:r>
           </w:p>
         </w:tc>
@@ -104,7 +104,7 @@
           </w:tcPr>
           <w:p>
             <w:r>
-              <w:t>Primary plus context contrasts, same ET</w:t>
+              <w:t>Business baseline, disruption lens, ledger, potency, severity/time, incumbent dilemma, bounded action</w:t>
             </w:r>
           </w:p>
         </w:tc>
@@ -114,7 +114,7 @@
           </w:tcPr>
           <w:p>
             <w:r>
-              <w:t>Three original returned v0 JSONs preserved unchanged; exact input/evidence snapshots retained</w:t>
+              <w:t>Implemented in specialist instructions and discussed in report. Actual model ledger/category-object compliance remains partial and is explicitly documented</w:t>
             </w:r>
           </w:p>
         </w:tc>
@@ -126,7 +126,7 @@
           </w:tcPr>
           <w:p>
             <w:r>
-              <w:t>Actual structural validation</w:t>
+              <w:t>Three context levels / same technology</w:t>
             </w:r>
           </w:p>
         </w:tc>
@@ -136,7 +136,7 @@
           </w:tcPr>
           <w:p>
             <w:r>
-              <w:t>All three pass instructor checker and full Draft 2020-12 schema</w:t>
+              <w:t>Preserved in three cases and outputs; stable general finding and valid paid-value differences reviewed</w:t>
             </w:r>
           </w:p>
         </w:tc>
@@ -148,7 +148,7 @@
           </w:tcPr>
           <w:p>
             <w:r>
-              <w:t>Stable and changed findings</w:t>
+              <w:t>Real primary/contrast tests</w:t>
             </w:r>
           </w:p>
         </w:tc>
@@ -158,7 +158,7 @@
           </w:tcPr>
           <w:p>
             <w:r>
-              <w:t>Independently documented in critical review; valid value-capture difference distinguished from confounded rating ladder</w:t>
+              <w:t>Three v0 plus three v1 original JSONs; both handoffs and hashes preserved</w:t>
             </w:r>
           </w:p>
         </w:tc>
@@ -170,7 +170,7 @@
           </w:tcPr>
           <w:p>
             <w:r>
-              <w:t>Genuine weakness and revision</w:t>
+              <w:t>Genuine weakness, revision and retest</w:t>
             </w:r>
           </w:p>
         </w:tc>
@@ -180,7 +180,7 @@
           </w:tcPr>
           <w:p>
             <w:r>
-              <w:t>Exact observed passages preserved, v0 baseline retained, 0.4 controls added</w:t>
+              <w:t>Exact v0 weaknesses, retained baseline, 0.4 revision and actual v1 outputs; correction/partial/non-correction table in retest assessment</w:t>
             </w:r>
           </w:p>
         </w:tc>
@@ -192,7 +192,7 @@
           </w:tcPr>
           <w:p>
             <w:r>
-              <w:t>Behavioral retest of revision</w:t>
+              <w:t>Actual validation</w:t>
             </w:r>
           </w:p>
         </w:tc>
@@ -202,7 +202,29 @@
           </w:tcPr>
           <w:p>
             <w:r>
-              <w:t>PENDING — no v1 outputs exist; packets and acceptance criteria supplied</w:t>
+              <w:t>Six instructor-validator passes and six full-schema passes; not factual/analytical guarantees</w:t>
+            </w:r>
+          </w:p>
+        </w:tc>
+      </w:tr>
+      <w:tr>
+        <w:tc>
+          <w:tcPr>
+            <w:tcW w:type="dxa" w:w="5040"/>
+          </w:tcPr>
+          <w:p>
+            <w:r>
+              <w:t>Runtime provenance</w:t>
+            </w:r>
+          </w:p>
+        </w:tc>
+        <w:tc>
+          <w:tcPr>
+            <w:tcW w:type="dxa" w:w="5040"/>
+          </w:tcPr>
+          <w:p>
+            <w:r>
+              <w:t>v1 generated in ONE ChatGPT conversation from revised specifications, NOT three independent fresh chats; settings/transcript not independently established</w:t>
             </w:r>
           </w:p>
         </w:tc>
@@ -224,7 +246,7 @@
           </w:tcPr>
           <w:p>
             <w:r>
-              <w:t>Filled with actual results and pending items; student identity and revised-run outcome still needed</w:t>
+              <w:t>Completed actual-work record; student name/team must be entered</w:t>
             </w:r>
           </w:p>
         </w:tc>
@@ -236,7 +258,7 @@
           </w:tcPr>
           <w:p>
             <w:r>
-              <w:t>Primary-case output report</w:t>
+              <w:t>Primary-case report</w:t>
             </w:r>
           </w:p>
         </w:tc>
@@ -246,7 +268,7 @@
           </w:tcPr>
           <w:p>
             <w:r>
-              <w:t>English readable report of actual v0 plus clearly separated reviewer analysis</w:t>
+              <w:t>Readable actual-v1 report with separate reviewer synthesis and limitations</w:t>
             </w:r>
           </w:p>
         </w:tc>
@@ -258,7 +280,7 @@
           </w:tcPr>
           <w:p>
             <w:r>
-              <w:t>Independent judgment ≤half page</w:t>
+              <w:t>Independent judgment</w:t>
             </w:r>
           </w:p>
         </w:tc>
@@ -268,7 +290,7 @@
           </w:tcPr>
           <w:p>
             <w:r>
-              <w:t>English short draft; student review required</w:t>
+              <w:t>Short English personal-review draft, designed for ≤half page in supplied Word layout</w:t>
             </w:r>
           </w:p>
         </w:tc>
@@ -280,7 +302,7 @@
           </w:tcPr>
           <w:p>
             <w:r>
-              <w:t>AI Use and Verification Note</w:t>
+              <w:t>AI use/verification</w:t>
             </w:r>
           </w:p>
         </w:tc>
@@ -290,7 +312,7 @@
           </w:tcPr>
           <w:p>
             <w:r>
-              <w:t>Written; distinguishes source checking, external v0 generation, local tests and pending retest</w:t>
+              <w:t>Original-source scope, user-provided model runs and independent review distinguished</w:t>
             </w:r>
           </w:p>
         </w:tc>
@@ -302,7 +324,7 @@
           </w:tcPr>
           <w:p>
             <w:r>
-              <w:t>Craft Gained ≤100 words</w:t>
+              <w:t>Craft Gained</w:t>
             </w:r>
           </w:p>
         </w:tc>
@@ -312,7 +334,7 @@
           </w:tcPr>
           <w:p>
             <w:r>
-              <w:t>English 80-word body draft (check generated word-count record); student must make it personally accurate</w:t>
+              <w:t>≤100-word English personal-review draft; word count in final QA log</w:t>
             </w:r>
           </w:p>
         </w:tc>
@@ -324,7 +346,7 @@
           </w:tcPr>
           <w:p>
             <w:r>
-              <w:t>Team handoff / limits</w:t>
+              <w:t>Team handoff</w:t>
             </w:r>
           </w:p>
         </w:tc>
@@ -334,7 +356,7 @@
           </w:tcPr>
           <w:p>
             <w:r>
-              <w:t>Written; no final validated-agent claim</w:t>
+              <w:t>Recommendation, escalation, integration boundary and remaining defects recorded</w:t>
             </w:r>
           </w:p>
         </w:tc>
@@ -346,7 +368,7 @@
           </w:tcPr>
           <w:p>
             <w:r>
-              <w:t>Repository/branch/source commit</w:t>
+              <w:t>Repository/branch/commit</w:t>
             </w:r>
           </w:p>
         </w:tc>
@@ -356,29 +378,7 @@
           </w:tcPr>
           <w:p>
             <w:r>
-              <w:t>Branch recorded; exact source SHA in package manifest</w:t>
-            </w:r>
-          </w:p>
-        </w:tc>
-      </w:tr>
-      <w:tr>
-        <w:tc>
-          <w:tcPr>
-            <w:tcW w:type="dxa" w:w="5040"/>
-          </w:tcPr>
-          <w:p>
-            <w:r>
-              <w:t>Brightspace instructions</w:t>
-            </w:r>
-          </w:p>
-        </w:tc>
-        <w:tc>
-          <w:tcPr>
-            <w:tcW w:type="dxa" w:w="5040"/>
-          </w:tcPr>
-          <w:p>
-            <w:r>
-              <w:t>Materials identify required artifacts, not actual due date/UI/accepted upload formats; verify those in course site</w:t>
+              <w:t>Exact final source SHA in package manifest; packaging commit may differ</w:t>
             </w:r>
           </w:p>
         </w:tc>
@@ -389,27 +389,89 @@
         <w:pStyle w:val="Heading2"/>
       </w:pPr>
       <w:r>
-        <w:t>Before submitting</w:t>
+        <w:t>What to upload</w:t>
       </w:r>
     </w:p>
     <w:p>
       <w:r>
-        <w:t>1. Run all three 0.4 retest packets in normal ChatGPT and return exact v1 JSONs. Validate and critically compare with v0; keep persisting weaknesses honest. Update report/record with actual outcomes, not anticipated fixes.</w:t>
+        <w:t>The final ZIP places the required documents at its top level:</w:t>
+      </w:r>
+    </w:p>
+    <w:p>
+      <w:pPr>
+        <w:pStyle w:val="ListBullet"/>
+      </w:pPr>
+      <w:r>
+        <w:t>01_Agent_Record.docx</w:t>
+      </w:r>
+    </w:p>
+    <w:p>
+      <w:pPr>
+        <w:pStyle w:val="ListBullet"/>
+      </w:pPr>
+      <w:r>
+        <w:t>02_Primary_Case_Output_Report.docx</w:t>
+      </w:r>
+    </w:p>
+    <w:p>
+      <w:pPr>
+        <w:pStyle w:val="ListBullet"/>
+      </w:pPr>
+      <w:r>
+        <w:t>03_Independent_Professional_Judgment_Draft.docx</w:t>
+      </w:r>
+    </w:p>
+    <w:p>
+      <w:pPr>
+        <w:pStyle w:val="ListBullet"/>
+      </w:pPr>
+      <w:r>
+        <w:t>04_AI_Use_and_Verification_Note.docx</w:t>
+      </w:r>
+    </w:p>
+    <w:p>
+      <w:pPr>
+        <w:pStyle w:val="ListBullet"/>
+      </w:pPr>
+      <w:r>
+        <w:t>05_Craft_Gained_Draft.docx</w:t>
+      </w:r>
+    </w:p>
+    <w:p>
+      <w:pPr>
+        <w:pStyle w:val="ListBullet"/>
+      </w:pPr>
+      <w:r>
+        <w:t>06_Team_Handoff.docx</w:t>
+      </w:r>
+    </w:p>
+    <w:p>
+      <w:pPr>
+        <w:pStyle w:val="ListBullet"/>
+      </w:pPr>
+      <w:r>
+        <w:t>07_Submission_Checklist.docx</w:t>
+      </w:r>
+    </w:p>
+    <w:p>
+      <w:pPr>
+        <w:pStyle w:val="ListBullet"/>
+      </w:pPr>
+      <w:r>
+        <w:t>Agent_Package/: full preserved scaffold plus specialist/test/evidence records.</w:t>
+      </w:r>
+    </w:p>
+    <w:p>
+      <w:pPr>
+        <w:pStyle w:val="ListBullet"/>
+      </w:pPr>
+      <w:r>
+        <w:t>submission_manifest.json: source commit, status, file hashes and runtime caveat.</w:t>
       </w:r>
     </w:p>
     <w:p>
       <w:r>
-        <w:t>2. Review the independent judgment and Craft Gained. Edit them to match the student's own views/experience; add name/team where required.</w:t>
-      </w:r>
-    </w:p>
-    <w:p>
-      <w:r>
-        <w:t>3. Recheck frozen integrity and package contents; record the tested source commit. Rebuild the package after retest.</w:t>
-      </w:r>
-    </w:p>
-    <w:p>
-      <w:r>
-        <w:t>4. In the actual Brightspace Assignment 2 item, follow the instructor's accepted formats and upload instructions. Submit the completed Agent Package/Record, readable primary output report, independent judgment, AI verification note and Craft Gained as required. Do not submit the temporary retest-input ZIP as the assignment. No unsupported deadline or precise UI workflow is supplied here.</w:t>
+        <w:t>Markdown counterparts are retained in the agent's deliverables folder. The retest inputs alone are not the assignment. Historical review/retest ZIPs in GitHub are superseded by Assignment_2_Brightspace_Submission.zip.</w:t>
       </w:r>
     </w:p>
     <w:p>
@@ -417,12 +479,32 @@
         <w:pStyle w:val="Heading2"/>
       </w:pPr>
       <w:r>
-        <w:t>Archive contents</w:t>
+        <w:t>Final student actions</w:t>
       </w:r>
     </w:p>
     <w:p>
       <w:r>
-        <w:t>The review archive contains the intact original scaffold, student agent, evidence references/access log, actual v0 responses and handoff, validation records, v0 instruction/prompt baselines, revised instructions/retest packets, English Markdown/Word deliverables and a source manifest. It omits the private classroom chapter/assignment uploads and external copyrighted full papers. The separate retest ZIP contains only the three complete revised prompts and instructions; it is an execution aid, not a submission package.</w:t>
+        <w:t>1. Review the independent judgment and Craft Gained for personal accuracy; revise wording if necessary. Enter student/team identification in the Agent Record and any required course fields.</w:t>
+      </w:r>
+    </w:p>
+    <w:p>
+      <w:r>
+        <w:t>2. Open the actual Brightspace Assignment 2 item and check its due date, format/file-count rules and current instructions. Those platform details were not included in the supplied documents and are not invented here.</w:t>
+      </w:r>
+    </w:p>
+    <w:p>
+      <w:r>
+        <w:t>3. If the item accepts a single complete ZIP, use the final submission ZIP after personal edits. If it requests separate documents, extract and upload the named files plus the Agent Package as directed. Retain all raw v0/v1 evidence and residual limitations.</w:t>
+      </w:r>
+    </w:p>
+    <w:p>
+      <w:r>
+        <w:t>4. Confirm uploaded filenames/previews in Brightspace and complete the site's submission action; save its receipt. This agent has not uploaded or submitted anything to Brightspace.</w:t>
+      </w:r>
+    </w:p>
+    <w:p>
+      <w:r>
+        <w:t>Future fresh-session replication is recommended to improve reliability; no such independent execution is claimed or required to be pretended complete. Retain failed/partial criteria in the submission rather than hiding them.</w:t>
       </w:r>
     </w:p>
     <w:sectPr>
@@ -443,7 +525,7 @@
       <w:pStyle w:val="Caption"/>
     </w:pPr>
     <w:r>
-      <w:t>Assignment 2 | Review draft — behavioral retest pending</w:t>
+      <w:t>Assignment 2 | Source-linked analysis and test record</w:t>
     </w:r>
   </w:p>
 </w:hdr>

</xml_diff>